<commit_message>
feat(report): PR-4 辽港数据期刊 PPTX 重设计
全量切换 PptxGenJS renderer 至辽港数据期刊视觉系统：
- 16:9 画布 (13.333×7.5")、纸色背景 (#FBF6EE)、古铜强调 (#AC916B)、navy 主色 (#004889)
- 主题驱动图表颜色、KPI strip 渲染、附录 deck 自动生成
- 幻灯片尺寸通过 CLI args 流入 Node executor，retry 装饰器包装桥接调用
- echoarts_to_pptxgen(option, theme=None) 主题驱动图表转换
- 新增 review_pptx() PPTX 专用质量审查（5 维度规则检查）
- 移除幻灯片级 PNG fallback，不支持图表改为文本占位符
- 所有 slide builder 重写：封面/TOC/章节分隔/叙述/图表+KPI/总结/结语/附录
- 新增 _ROMAN 字典、FONT_DISPLAY/FONT_UI 主题常量
- 测试更新：罗马数字断言、append flush 测试、golden 重生成

🤖 Generated with [Qoder](https://qoder.com)
</commit_message>
<xml_diff>
--- a/tests/fixtures/report_baseline/enhanced/golden.docx
+++ b/tests/fixtures/report_baseline/enhanced/golden.docx
@@ -5,43 +5,76 @@
     <w:p/>
     <w:p/>
     <w:p/>
+    <w:p>
+      <w:pPr>
+        <w:spacing w:after="0"/>
+        <w:shd w:val="clear" w:color="auto" w:fill="AC916B"/>
+      </w:pPr>
+      <w:r>
+        <w:rPr>
+          <w:color w:val="AC916B"/>
+          <w:sz w:val="16"/>
+        </w:rPr>
+        <w:t xml:space="preserve"> </w:t>
+      </w:r>
+    </w:p>
     <w:p/>
     <w:p>
       <w:pPr>
-        <w:jc w:val="center"/>
+        <w:pStyle w:val="Title"/>
+        <w:jc w:val="left"/>
       </w:pPr>
       <w:r>
         <w:rPr>
-          <w:rFonts w:ascii="Microsoft YaHei" w:hAnsi="Microsoft YaHei"/>
+          <w:rFonts w:ascii="Noto Serif SC" w:hAnsi="Noto Serif SC"/>
           <w:b/>
-          <w:color w:val="1E3A5F"/>
-          <w:sz w:val="56"/>
+          <w:color w:val="004889"/>
+          <w:sz w:val="64"/>
         </w:rPr>
         <w:t>2026 Q1 港区吞吐量分析报告 (Enhanced)</w:t>
       </w:r>
     </w:p>
     <w:p>
       <w:pPr>
-        <w:jc w:val="center"/>
+        <w:pStyle w:val="Subtitle"/>
+        <w:jc w:val="left"/>
       </w:pPr>
       <w:r>
         <w:rPr>
-          <w:color w:val="F0A500"/>
-          <w:sz w:val="28"/>
+          <w:rFonts w:ascii="Noto Serif SC" w:hAnsi="Noto Serif SC"/>
+          <w:i/>
+          <w:color w:val="336EA4"/>
+          <w:sz w:val="36"/>
         </w:rPr>
-        <w:t>━━━━━━━━━━━━━━━━━━━━━━━━━━━━━━</w:t>
+        <w:t>Analytica Test</w:t>
+      </w:r>
+    </w:p>
+    <w:p/>
+    <w:p/>
+    <w:p>
+      <w:pPr>
+        <w:jc w:val="left"/>
+      </w:pPr>
+      <w:r>
+        <w:rPr>
+          <w:rFonts w:ascii="Noto Sans SC" w:hAnsi="Noto Sans SC"/>
+          <w:color w:val="AC916B"/>
+          <w:sz w:val="18"/>
+          <w:smallCaps w:val="true"/>
+        </w:rPr>
+        <w:t>日期：2026-04-29</w:t>
       </w:r>
     </w:p>
     <w:p>
       <w:pPr>
-        <w:jc w:val="center"/>
+        <w:jc w:val="left"/>
       </w:pPr>
       <w:r>
         <w:rPr>
-          <w:color w:val="546E7A"/>
-          <w:sz w:val="24"/>
+          <w:color w:val="AC916B"/>
+          <w:sz w:val="20"/>
         </w:rPr>
-        <w:t>编制：Analytica Test    日期：2026-04-29</w:t>
+        <w:t>■</w:t>
       </w:r>
     </w:p>
     <w:p>
@@ -73,8 +106,8 @@
       <w:r>
         <w:rPr>
           <w:i/>
-          <w:color w:val="546E7A"/>
-          <w:sz w:val="20"/>
+          <w:color w:val="9A8E78"/>
+          <w:sz w:val="18"/>
         </w:rPr>
         <w:t>（请在 Word 中右键此处，选择"更新域"以生成目录）</w:t>
       </w:r>
@@ -100,7 +133,7 @@
         <w:tc>
           <w:tcPr>
             <w:tcW w:type="dxa" w:w="2160"/>
-            <w:shd w:fill="F5F7FA"/>
+            <w:shd w:fill="FBF6EE"/>
           </w:tcPr>
           <w:p>
             <w:pPr>
@@ -108,8 +141,9 @@
             </w:pPr>
             <w:r>
               <w:rPr>
-                <w:color w:val="546E7A"/>
-                <w:sz w:val="18"/>
+                <w:rFonts w:ascii="Noto Sans SC" w:hAnsi="Noto Sans SC"/>
+                <w:color w:val="9A8E78"/>
+                <w:sz w:val="16"/>
               </w:rPr>
               <w:t>总吞吐量</w:t>
             </w:r>
@@ -120,9 +154,10 @@
             </w:pPr>
             <w:r>
               <w:rPr>
+                <w:rFonts w:ascii="JetBrains Mono" w:hAnsi="JetBrains Mono"/>
                 <w:b/>
-                <w:color w:val="2E7D32"/>
-                <w:sz w:val="36"/>
+                <w:color w:val="004889"/>
+                <w:sz w:val="56"/>
               </w:rPr>
               <w:t>9500.6 万吨</w:t>
             </w:r>
@@ -133,8 +168,9 @@
             </w:pPr>
             <w:r>
               <w:rPr>
-                <w:color w:val="546E7A"/>
-                <w:sz w:val="16"/>
+                <w:rFonts w:ascii="Noto Sans SC" w:hAnsi="Noto Sans SC"/>
+                <w:color w:val="9A8E78"/>
+                <w:sz w:val="18"/>
               </w:rPr>
               <w:t>2026 Q1</w:t>
             </w:r>
@@ -143,7 +179,7 @@
         <w:tc>
           <w:tcPr>
             <w:tcW w:type="dxa" w:w="2160"/>
-            <w:shd w:fill="F5F7FA"/>
+            <w:shd w:fill="FBF6EE"/>
           </w:tcPr>
           <w:p>
             <w:pPr>
@@ -151,8 +187,9 @@
             </w:pPr>
             <w:r>
               <w:rPr>
-                <w:color w:val="546E7A"/>
-                <w:sz w:val="18"/>
+                <w:rFonts w:ascii="Noto Sans SC" w:hAnsi="Noto Sans SC"/>
+                <w:color w:val="9A8E78"/>
+                <w:sz w:val="16"/>
               </w:rPr>
               <w:t>同比增长</w:t>
             </w:r>
@@ -163,9 +200,10 @@
             </w:pPr>
             <w:r>
               <w:rPr>
+                <w:rFonts w:ascii="JetBrains Mono" w:hAnsi="JetBrains Mono"/>
                 <w:b/>
-                <w:color w:val="2E7D32"/>
-                <w:sz w:val="36"/>
+                <w:color w:val="004889"/>
+                <w:sz w:val="56"/>
               </w:rPr>
               <w:t>12.0%</w:t>
             </w:r>
@@ -176,8 +214,9 @@
             </w:pPr>
             <w:r>
               <w:rPr>
-                <w:color w:val="546E7A"/>
-                <w:sz w:val="16"/>
+                <w:rFonts w:ascii="Noto Sans SC" w:hAnsi="Noto Sans SC"/>
+                <w:color w:val="9A8E78"/>
+                <w:sz w:val="18"/>
               </w:rPr>
               <w:t>YoY</w:t>
             </w:r>
@@ -186,7 +225,7 @@
         <w:tc>
           <w:tcPr>
             <w:tcW w:type="dxa" w:w="2160"/>
-            <w:shd w:fill="F5F7FA"/>
+            <w:shd w:fill="FBF6EE"/>
           </w:tcPr>
           <w:p>
             <w:pPr>
@@ -194,8 +233,9 @@
             </w:pPr>
             <w:r>
               <w:rPr>
-                <w:color w:val="546E7A"/>
-                <w:sz w:val="18"/>
+                <w:rFonts w:ascii="Noto Sans SC" w:hAnsi="Noto Sans SC"/>
+                <w:color w:val="9A8E78"/>
+                <w:sz w:val="16"/>
               </w:rPr>
               <w:t>最高港区</w:t>
             </w:r>
@@ -206,9 +246,10 @@
             </w:pPr>
             <w:r>
               <w:rPr>
+                <w:rFonts w:ascii="JetBrains Mono" w:hAnsi="JetBrains Mono"/>
                 <w:b/>
-                <w:color w:val="1E3A5F"/>
-                <w:sz w:val="36"/>
+                <w:color w:val="004889"/>
+                <w:sz w:val="56"/>
               </w:rPr>
               <w:t>大连港</w:t>
             </w:r>
@@ -219,8 +260,9 @@
             </w:pPr>
             <w:r>
               <w:rPr>
-                <w:color w:val="546E7A"/>
-                <w:sz w:val="16"/>
+                <w:rFonts w:ascii="Noto Sans SC" w:hAnsi="Noto Sans SC"/>
+                <w:color w:val="9A8E78"/>
+                <w:sz w:val="18"/>
               </w:rPr>
               <w:t>4500.5 万吨</w:t>
             </w:r>
@@ -229,7 +271,7 @@
         <w:tc>
           <w:tcPr>
             <w:tcW w:type="dxa" w:w="2160"/>
-            <w:shd w:fill="F5F7FA"/>
+            <w:shd w:fill="FBF6EE"/>
           </w:tcPr>
           <w:p>
             <w:pPr>
@@ -237,8 +279,9 @@
             </w:pPr>
             <w:r>
               <w:rPr>
-                <w:color w:val="546E7A"/>
-                <w:sz w:val="18"/>
+                <w:rFonts w:ascii="Noto Sans SC" w:hAnsi="Noto Sans SC"/>
+                <w:color w:val="9A8E78"/>
+                <w:sz w:val="16"/>
               </w:rPr>
               <w:t>负增长港</w:t>
             </w:r>
@@ -249,9 +292,10 @@
             </w:pPr>
             <w:r>
               <w:rPr>
+                <w:rFonts w:ascii="JetBrains Mono" w:hAnsi="JetBrains Mono"/>
                 <w:b/>
-                <w:color w:val="C62828"/>
-                <w:sz w:val="36"/>
+                <w:color w:val="8B4A2B"/>
+                <w:sz w:val="56"/>
               </w:rPr>
               <w:t>锦州港</w:t>
             </w:r>
@@ -262,8 +306,9 @@
             </w:pPr>
             <w:r>
               <w:rPr>
-                <w:color w:val="546E7A"/>
-                <w:sz w:val="16"/>
+                <w:rFonts w:ascii="Noto Sans SC" w:hAnsi="Noto Sans SC"/>
+                <w:color w:val="9A8E78"/>
+                <w:sz w:val="18"/>
               </w:rPr>
               <w:t>-3.0%</w:t>
             </w:r>
@@ -274,6 +319,21 @@
     <w:p/>
     <w:p>
       <w:pPr>
+        <w:spacing w:after="0" w:before="320"/>
+        <w:ind w:firstLine="0"/>
+      </w:pPr>
+      <w:r>
+        <w:rPr>
+          <w:rFonts w:ascii="Noto Serif SC" w:hAnsi="Noto Serif SC"/>
+          <w:i/>
+          <w:color w:val="AC916B"/>
+          <w:sz w:val="72"/>
+        </w:rPr>
+        <w:t>I</w:t>
+      </w:r>
+    </w:p>
+    <w:p>
+      <w:pPr>
         <w:pStyle w:val="Heading1"/>
       </w:pPr>
       <w:r>
@@ -282,14 +342,34 @@
     </w:p>
     <w:p>
       <w:pPr>
-        <w:ind w:firstLine="425"/>
+        <w:pStyle w:val="Lede"/>
+        <w:spacing w:after="240"/>
+        <w:ind w:firstLine="0"/>
+        <w:framePr w:dropCap="drop" w:lines="3" w:wrap="around" w:vAnchor="text" w:hAnchor="text"/>
       </w:pPr>
       <w:r>
         <w:rPr>
-          <w:rFonts w:ascii="Microsoft YaHei" w:hAnsi="Microsoft YaHei"/>
-          <w:sz w:val="24"/>
+          <w:rFonts w:ascii="Noto Serif SC" w:hAnsi="Noto Serif SC"/>
+          <w:i/>
+          <w:color w:val="004889"/>
+          <w:sz w:val="72"/>
         </w:rPr>
         <w:t>2026 Q1 三港区合计吞吐量 9500.6 万吨，同比增长 12%。大连港持续领跑，锦州港受天气拖累出现负增长。</w:t>
+      </w:r>
+    </w:p>
+    <w:p>
+      <w:pPr>
+        <w:spacing w:after="0" w:before="320"/>
+        <w:ind w:firstLine="0"/>
+      </w:pPr>
+      <w:r>
+        <w:rPr>
+          <w:rFonts w:ascii="Noto Serif SC" w:hAnsi="Noto Serif SC"/>
+          <w:i/>
+          <w:color w:val="AC916B"/>
+          <w:sz w:val="72"/>
+        </w:rPr>
+        <w:t>II</w:t>
       </w:r>
     </w:p>
     <w:p>
@@ -298,14 +378,6 @@
       </w:pPr>
       <w:r>
         <w:t>二、现状分析</w:t>
-      </w:r>
-    </w:p>
-    <w:p>
-      <w:pPr>
-        <w:pStyle w:val="Heading2"/>
-      </w:pPr>
-      <w:r>
-        <w:t>港区吞吐量</w:t>
       </w:r>
     </w:p>
     <w:p>
@@ -345,221 +417,6 @@
       </w:r>
     </w:p>
     <w:p/>
-    <w:p>
-      <w:pPr>
-        <w:pStyle w:val="Heading2"/>
-      </w:pPr>
-      <w:r>
-        <w:t>数据明细</w:t>
-      </w:r>
-    </w:p>
-    <w:tbl>
-      <w:tblPr>
-        <w:tblStyle w:val="TableGrid"/>
-        <w:tblW w:type="auto" w:w="0"/>
-        <w:jc w:val="center"/>
-        <w:tblLook w:firstColumn="1" w:firstRow="1" w:lastColumn="0" w:lastRow="0" w:noHBand="0" w:noVBand="1" w:val="04A0"/>
-      </w:tblPr>
-      <w:tblGrid>
-        <w:gridCol w:w="2880"/>
-        <w:gridCol w:w="2880"/>
-        <w:gridCol w:w="2880"/>
-      </w:tblGrid>
-      <w:tr>
-        <w:tc>
-          <w:tcPr>
-            <w:tcW w:type="dxa" w:w="2880"/>
-            <w:shd w:fill="1E3A5F"/>
-          </w:tcPr>
-          <w:p>
-            <w:r>
-              <w:rPr>
-                <w:b/>
-                <w:color w:val="FFFFFF"/>
-                <w:sz w:val="22"/>
-              </w:rPr>
-              <w:t>regionName</w:t>
-            </w:r>
-          </w:p>
-        </w:tc>
-        <w:tc>
-          <w:tcPr>
-            <w:tcW w:type="dxa" w:w="2880"/>
-            <w:shd w:fill="1E3A5F"/>
-          </w:tcPr>
-          <w:p>
-            <w:r>
-              <w:rPr>
-                <w:b/>
-                <w:color w:val="FFFFFF"/>
-                <w:sz w:val="22"/>
-              </w:rPr>
-              <w:t>throughput</w:t>
-            </w:r>
-          </w:p>
-        </w:tc>
-        <w:tc>
-          <w:tcPr>
-            <w:tcW w:type="dxa" w:w="2880"/>
-            <w:shd w:fill="1E3A5F"/>
-          </w:tcPr>
-          <w:p>
-            <w:r>
-              <w:rPr>
-                <w:b/>
-                <w:color w:val="FFFFFF"/>
-                <w:sz w:val="22"/>
-              </w:rPr>
-              <w:t>yoy</w:t>
-            </w:r>
-          </w:p>
-        </w:tc>
-      </w:tr>
-      <w:tr>
-        <w:tc>
-          <w:tcPr>
-            <w:tcW w:type="dxa" w:w="2880"/>
-          </w:tcPr>
-          <w:p>
-            <w:r>
-              <w:rPr>
-                <w:rFonts w:ascii="Calibri" w:hAnsi="Calibri"/>
-                <w:sz w:val="20"/>
-              </w:rPr>
-              <w:t>大连港</w:t>
-            </w:r>
-          </w:p>
-        </w:tc>
-        <w:tc>
-          <w:tcPr>
-            <w:tcW w:type="dxa" w:w="2880"/>
-          </w:tcPr>
-          <w:p>
-            <w:r>
-              <w:rPr>
-                <w:rFonts w:ascii="Calibri" w:hAnsi="Calibri"/>
-                <w:sz w:val="20"/>
-              </w:rPr>
-              <w:t>4,500.50</w:t>
-            </w:r>
-          </w:p>
-        </w:tc>
-        <w:tc>
-          <w:tcPr>
-            <w:tcW w:type="dxa" w:w="2880"/>
-          </w:tcPr>
-          <w:p>
-            <w:r>
-              <w:rPr>
-                <w:rFonts w:ascii="Calibri" w:hAnsi="Calibri"/>
-                <w:sz w:val="20"/>
-              </w:rPr>
-              <w:t>0.1200</w:t>
-            </w:r>
-          </w:p>
-        </w:tc>
-      </w:tr>
-      <w:tr>
-        <w:tc>
-          <w:tcPr>
-            <w:tcW w:type="dxa" w:w="2880"/>
-            <w:shd w:fill="F5F7FA"/>
-          </w:tcPr>
-          <w:p>
-            <w:r>
-              <w:rPr>
-                <w:rFonts w:ascii="Calibri" w:hAnsi="Calibri"/>
-                <w:sz w:val="20"/>
-              </w:rPr>
-              <w:t>营口港</w:t>
-            </w:r>
-          </w:p>
-        </w:tc>
-        <w:tc>
-          <w:tcPr>
-            <w:tcW w:type="dxa" w:w="2880"/>
-            <w:shd w:fill="F5F7FA"/>
-          </w:tcPr>
-          <w:p>
-            <w:r>
-              <w:rPr>
-                <w:rFonts w:ascii="Calibri" w:hAnsi="Calibri"/>
-                <w:sz w:val="20"/>
-              </w:rPr>
-              <w:t>3,200.10</w:t>
-            </w:r>
-          </w:p>
-        </w:tc>
-        <w:tc>
-          <w:tcPr>
-            <w:tcW w:type="dxa" w:w="2880"/>
-            <w:shd w:fill="F5F7FA"/>
-          </w:tcPr>
-          <w:p>
-            <w:r>
-              <w:rPr>
-                <w:rFonts w:ascii="Calibri" w:hAnsi="Calibri"/>
-                <w:sz w:val="20"/>
-              </w:rPr>
-              <w:t>0.0500</w:t>
-            </w:r>
-          </w:p>
-        </w:tc>
-      </w:tr>
-      <w:tr>
-        <w:tc>
-          <w:tcPr>
-            <w:tcW w:type="dxa" w:w="2880"/>
-          </w:tcPr>
-          <w:p>
-            <w:r>
-              <w:rPr>
-                <w:rFonts w:ascii="Calibri" w:hAnsi="Calibri"/>
-                <w:sz w:val="20"/>
-              </w:rPr>
-              <w:t>锦州港</w:t>
-            </w:r>
-          </w:p>
-        </w:tc>
-        <w:tc>
-          <w:tcPr>
-            <w:tcW w:type="dxa" w:w="2880"/>
-          </w:tcPr>
-          <w:p>
-            <w:r>
-              <w:rPr>
-                <w:rFonts w:ascii="Calibri" w:hAnsi="Calibri"/>
-                <w:sz w:val="20"/>
-              </w:rPr>
-              <w:t>1,800.00</w:t>
-            </w:r>
-          </w:p>
-        </w:tc>
-        <w:tc>
-          <w:tcPr>
-            <w:tcW w:type="dxa" w:w="2880"/>
-          </w:tcPr>
-          <w:p>
-            <w:r>
-              <w:rPr>
-                <w:rFonts w:ascii="Calibri" w:hAnsi="Calibri"/>
-                <w:sz w:val="20"/>
-              </w:rPr>
-              <w:t>-0.0300</w:t>
-            </w:r>
-          </w:p>
-        </w:tc>
-      </w:tr>
-    </w:tbl>
-    <w:p/>
-    <w:p>
-      <w:pPr>
-        <w:pStyle w:val="Heading2"/>
-      </w:pPr>
-      <w:r>
-        <w:t>市场份额</w:t>
-      </w:r>
-    </w:p>
     <w:p>
       <w:r>
         <w:drawing>
@@ -609,23 +466,23 @@
       <w:r>
         <w:rPr>
           <w:b/>
-          <w:sz w:val="24"/>
+          <w:sz w:val="22"/>
         </w:rPr>
         <w:t>throughput：</w:t>
       </w:r>
       <w:r>
         <w:rPr>
-          <w:rFonts w:ascii="Calibri" w:hAnsi="Calibri"/>
-          <w:color w:val="2E7D32"/>
-          <w:sz w:val="24"/>
+          <w:rFonts w:ascii="JetBrains Mono" w:hAnsi="JetBrains Mono"/>
+          <w:color w:val="004889"/>
+          <w:sz w:val="22"/>
         </w:rPr>
         <w:t xml:space="preserve">  同比 ↑12.00%</w:t>
       </w:r>
       <w:r>
         <w:rPr>
-          <w:rFonts w:ascii="Calibri" w:hAnsi="Calibri"/>
-          <w:color w:val="2E7D32"/>
-          <w:sz w:val="24"/>
+          <w:rFonts w:ascii="JetBrains Mono" w:hAnsi="JetBrains Mono"/>
+          <w:color w:val="004889"/>
+          <w:sz w:val="22"/>
         </w:rPr>
         <w:t xml:space="preserve">  环比 ↑3.00%</w:t>
       </w:r>
@@ -634,28 +491,370 @@
       <w:r>
         <w:rPr>
           <w:b/>
-          <w:sz w:val="24"/>
+          <w:sz w:val="22"/>
         </w:rPr>
         <w:t>share：</w:t>
       </w:r>
       <w:r>
         <w:rPr>
-          <w:rFonts w:ascii="Calibri" w:hAnsi="Calibri"/>
-          <w:color w:val="2E7D32"/>
-          <w:sz w:val="24"/>
+          <w:rFonts w:ascii="JetBrains Mono" w:hAnsi="JetBrains Mono"/>
+          <w:color w:val="004889"/>
+          <w:sz w:val="22"/>
         </w:rPr>
         <w:t xml:space="preserve">  同比 ↑4.00%</w:t>
       </w:r>
       <w:r>
         <w:rPr>
-          <w:rFonts w:ascii="Calibri" w:hAnsi="Calibri"/>
-          <w:color w:val="C62828"/>
-          <w:sz w:val="24"/>
+          <w:rFonts w:ascii="JetBrains Mono" w:hAnsi="JetBrains Mono"/>
+          <w:color w:val="8B4A2B"/>
+          <w:sz w:val="22"/>
         </w:rPr>
         <w:t xml:space="preserve">  环比 ↓1.00%</w:t>
       </w:r>
     </w:p>
     <w:p/>
+    <w:p>
+      <w:pPr>
+        <w:spacing w:before="160" w:after="0"/>
+        <w:pBdr>
+          <w:top w:val="single" w:sz="2" w:space="4" w:color="1F1A12"/>
+        </w:pBdr>
+      </w:pPr>
+    </w:p>
+    <w:p>
+      <w:bookmarkStart w:id="1" w:name="_appendix_完整数据"/>
+      <w:bookmarkEnd w:id="1"/>
+      <w:pPr>
+        <w:spacing w:before="240" w:after="160"/>
+      </w:pPr>
+      <w:r>
+        <w:rPr>
+          <w:rFonts w:ascii="Noto Sans SC" w:hAnsi="Noto Sans SC"/>
+          <w:b/>
+          <w:color w:val="336EA4"/>
+          <w:sz w:val="28"/>
+        </w:rPr>
+        <w:t>完整数据</w:t>
+      </w:r>
+    </w:p>
+    <w:tbl>
+      <w:tblPr>
+        <w:tblW w:type="auto" w:w="0"/>
+        <w:jc w:val="center"/>
+        <w:tblLook w:firstColumn="1" w:firstRow="1" w:lastColumn="0" w:lastRow="0" w:noHBand="0" w:noVBand="1" w:val="04A0"/>
+      </w:tblPr>
+      <w:tblGrid>
+        <w:gridCol w:w="2880"/>
+        <w:gridCol w:w="2880"/>
+        <w:gridCol w:w="2880"/>
+      </w:tblGrid>
+      <w:tr>
+        <w:tc>
+          <w:tcPr>
+            <w:tcW w:type="dxa" w:w="2880"/>
+            <w:tcBorders>
+              <w:left w:val="nil"/>
+              <w:right w:val="nil"/>
+              <w:top w:val="single" w:sz="8" w:color="1F1A12"/>
+              <w:bottom w:val="single" w:sz="4" w:color="1F1A12"/>
+            </w:tcBorders>
+          </w:tcPr>
+          <w:p>
+            <w:pPr>
+              <w:jc w:val="left"/>
+            </w:pPr>
+            <w:r>
+              <w:rPr>
+                <w:rFonts w:ascii="Noto Sans SC" w:hAnsi="Noto Sans SC"/>
+                <w:color w:val="9A8E78"/>
+                <w:sz w:val="18"/>
+                <w:smallCaps w:val="true"/>
+              </w:rPr>
+              <w:t>regionName</w:t>
+            </w:r>
+          </w:p>
+        </w:tc>
+        <w:tc>
+          <w:tcPr>
+            <w:tcW w:type="dxa" w:w="2880"/>
+            <w:tcBorders>
+              <w:left w:val="nil"/>
+              <w:right w:val="nil"/>
+              <w:top w:val="single" w:sz="8" w:color="1F1A12"/>
+              <w:bottom w:val="single" w:sz="4" w:color="1F1A12"/>
+            </w:tcBorders>
+          </w:tcPr>
+          <w:p>
+            <w:pPr>
+              <w:jc w:val="right"/>
+            </w:pPr>
+            <w:r>
+              <w:rPr>
+                <w:rFonts w:ascii="Noto Sans SC" w:hAnsi="Noto Sans SC"/>
+                <w:color w:val="9A8E78"/>
+                <w:sz w:val="18"/>
+                <w:smallCaps w:val="true"/>
+              </w:rPr>
+              <w:t>throughput</w:t>
+            </w:r>
+          </w:p>
+        </w:tc>
+        <w:tc>
+          <w:tcPr>
+            <w:tcW w:type="dxa" w:w="2880"/>
+            <w:tcBorders>
+              <w:left w:val="nil"/>
+              <w:right w:val="nil"/>
+              <w:top w:val="single" w:sz="8" w:color="1F1A12"/>
+              <w:bottom w:val="single" w:sz="4" w:color="1F1A12"/>
+            </w:tcBorders>
+          </w:tcPr>
+          <w:p>
+            <w:pPr>
+              <w:jc w:val="right"/>
+            </w:pPr>
+            <w:r>
+              <w:rPr>
+                <w:rFonts w:ascii="Noto Sans SC" w:hAnsi="Noto Sans SC"/>
+                <w:color w:val="9A8E78"/>
+                <w:sz w:val="18"/>
+                <w:smallCaps w:val="true"/>
+              </w:rPr>
+              <w:t>yoy</w:t>
+            </w:r>
+          </w:p>
+        </w:tc>
+      </w:tr>
+      <w:tr>
+        <w:tc>
+          <w:tcPr>
+            <w:tcW w:type="dxa" w:w="2880"/>
+            <w:tcBorders>
+              <w:top w:val="nil"/>
+              <w:left w:val="nil"/>
+              <w:bottom w:val="nil"/>
+              <w:right w:val="nil"/>
+            </w:tcBorders>
+          </w:tcPr>
+          <w:p>
+            <w:pPr>
+              <w:jc w:val="left"/>
+            </w:pPr>
+            <w:r>
+              <w:rPr>
+                <w:rFonts w:ascii="Noto Serif SC" w:hAnsi="Noto Serif SC"/>
+                <w:sz w:val="20"/>
+              </w:rPr>
+              <w:t>大连港</w:t>
+            </w:r>
+          </w:p>
+        </w:tc>
+        <w:tc>
+          <w:tcPr>
+            <w:tcW w:type="dxa" w:w="2880"/>
+            <w:tcBorders>
+              <w:top w:val="nil"/>
+              <w:left w:val="nil"/>
+              <w:bottom w:val="nil"/>
+              <w:right w:val="nil"/>
+            </w:tcBorders>
+          </w:tcPr>
+          <w:p>
+            <w:pPr>
+              <w:jc w:val="right"/>
+            </w:pPr>
+            <w:r>
+              <w:rPr>
+                <w:rFonts w:ascii="JetBrains Mono" w:hAnsi="JetBrains Mono"/>
+                <w:sz w:val="20"/>
+              </w:rPr>
+              <w:t>4,500.50</w:t>
+            </w:r>
+          </w:p>
+        </w:tc>
+        <w:tc>
+          <w:tcPr>
+            <w:tcW w:type="dxa" w:w="2880"/>
+            <w:tcBorders>
+              <w:top w:val="nil"/>
+              <w:left w:val="nil"/>
+              <w:bottom w:val="nil"/>
+              <w:right w:val="nil"/>
+            </w:tcBorders>
+          </w:tcPr>
+          <w:p>
+            <w:pPr>
+              <w:jc w:val="right"/>
+            </w:pPr>
+            <w:r>
+              <w:rPr>
+                <w:rFonts w:ascii="JetBrains Mono" w:hAnsi="JetBrains Mono"/>
+                <w:sz w:val="20"/>
+              </w:rPr>
+              <w:t>0.1200</w:t>
+            </w:r>
+          </w:p>
+        </w:tc>
+      </w:tr>
+      <w:tr>
+        <w:tc>
+          <w:tcPr>
+            <w:tcW w:type="dxa" w:w="2880"/>
+            <w:tcBorders>
+              <w:top w:val="nil"/>
+              <w:left w:val="nil"/>
+              <w:bottom w:val="nil"/>
+              <w:right w:val="nil"/>
+            </w:tcBorders>
+          </w:tcPr>
+          <w:p>
+            <w:pPr>
+              <w:jc w:val="left"/>
+            </w:pPr>
+            <w:r>
+              <w:rPr>
+                <w:rFonts w:ascii="Noto Serif SC" w:hAnsi="Noto Serif SC"/>
+                <w:sz w:val="20"/>
+              </w:rPr>
+              <w:t>营口港</w:t>
+            </w:r>
+          </w:p>
+        </w:tc>
+        <w:tc>
+          <w:tcPr>
+            <w:tcW w:type="dxa" w:w="2880"/>
+            <w:tcBorders>
+              <w:top w:val="nil"/>
+              <w:left w:val="nil"/>
+              <w:bottom w:val="nil"/>
+              <w:right w:val="nil"/>
+            </w:tcBorders>
+          </w:tcPr>
+          <w:p>
+            <w:pPr>
+              <w:jc w:val="right"/>
+            </w:pPr>
+            <w:r>
+              <w:rPr>
+                <w:rFonts w:ascii="JetBrains Mono" w:hAnsi="JetBrains Mono"/>
+                <w:sz w:val="20"/>
+              </w:rPr>
+              <w:t>3,200.10</w:t>
+            </w:r>
+          </w:p>
+        </w:tc>
+        <w:tc>
+          <w:tcPr>
+            <w:tcW w:type="dxa" w:w="2880"/>
+            <w:tcBorders>
+              <w:top w:val="nil"/>
+              <w:left w:val="nil"/>
+              <w:bottom w:val="nil"/>
+              <w:right w:val="nil"/>
+            </w:tcBorders>
+          </w:tcPr>
+          <w:p>
+            <w:pPr>
+              <w:jc w:val="right"/>
+            </w:pPr>
+            <w:r>
+              <w:rPr>
+                <w:rFonts w:ascii="JetBrains Mono" w:hAnsi="JetBrains Mono"/>
+                <w:sz w:val="20"/>
+              </w:rPr>
+              <w:t>0.0500</w:t>
+            </w:r>
+          </w:p>
+        </w:tc>
+      </w:tr>
+      <w:tr>
+        <w:tc>
+          <w:tcPr>
+            <w:tcW w:type="dxa" w:w="2880"/>
+            <w:tcBorders>
+              <w:top w:val="nil"/>
+              <w:left w:val="nil"/>
+              <w:right w:val="nil"/>
+              <w:bottom w:val="single" w:sz="8" w:color="1F1A12"/>
+            </w:tcBorders>
+          </w:tcPr>
+          <w:p>
+            <w:pPr>
+              <w:jc w:val="left"/>
+            </w:pPr>
+            <w:r>
+              <w:rPr>
+                <w:rFonts w:ascii="Noto Serif SC" w:hAnsi="Noto Serif SC"/>
+                <w:sz w:val="20"/>
+              </w:rPr>
+              <w:t>锦州港</w:t>
+            </w:r>
+          </w:p>
+        </w:tc>
+        <w:tc>
+          <w:tcPr>
+            <w:tcW w:type="dxa" w:w="2880"/>
+            <w:tcBorders>
+              <w:top w:val="nil"/>
+              <w:left w:val="nil"/>
+              <w:right w:val="nil"/>
+              <w:bottom w:val="single" w:sz="8" w:color="1F1A12"/>
+            </w:tcBorders>
+          </w:tcPr>
+          <w:p>
+            <w:pPr>
+              <w:jc w:val="right"/>
+            </w:pPr>
+            <w:r>
+              <w:rPr>
+                <w:rFonts w:ascii="JetBrains Mono" w:hAnsi="JetBrains Mono"/>
+                <w:sz w:val="20"/>
+              </w:rPr>
+              <w:t>1,800.00</w:t>
+            </w:r>
+          </w:p>
+        </w:tc>
+        <w:tc>
+          <w:tcPr>
+            <w:tcW w:type="dxa" w:w="2880"/>
+            <w:tcBorders>
+              <w:top w:val="nil"/>
+              <w:left w:val="nil"/>
+              <w:right w:val="nil"/>
+              <w:bottom w:val="single" w:sz="8" w:color="1F1A12"/>
+            </w:tcBorders>
+          </w:tcPr>
+          <w:p>
+            <w:pPr>
+              <w:jc w:val="right"/>
+            </w:pPr>
+            <w:r>
+              <w:rPr>
+                <w:rFonts w:ascii="JetBrains Mono" w:hAnsi="JetBrains Mono"/>
+                <w:sz w:val="20"/>
+              </w:rPr>
+              <w:t>-0.0300</w:t>
+            </w:r>
+          </w:p>
+        </w:tc>
+      </w:tr>
+    </w:tbl>
+    <w:p/>
+    <w:p>
+      <w:pPr>
+        <w:spacing w:after="0" w:before="320"/>
+        <w:ind w:firstLine="0"/>
+      </w:pPr>
+      <w:r>
+        <w:rPr>
+          <w:rFonts w:ascii="Noto Serif SC" w:hAnsi="Noto Serif SC"/>
+          <w:i/>
+          <w:color w:val="AC916B"/>
+          <w:sz w:val="72"/>
+        </w:rPr>
+        <w:t>III</w:t>
+      </w:r>
+    </w:p>
     <w:p>
       <w:pPr>
         <w:pStyle w:val="Heading1"/>
@@ -687,14 +886,14 @@
         <w:tc>
           <w:tcPr>
             <w:tcW w:type="dxa" w:w="4320"/>
-            <w:shd w:fill="1E3A5F"/>
+            <w:shd w:fill="004889"/>
           </w:tcPr>
           <w:p>
             <w:r>
               <w:rPr>
                 <w:b/>
-                <w:color w:val="FFFFFF"/>
-                <w:sz w:val="22"/>
+                <w:color w:val="FFFEFB"/>
+                <w:sz w:val="18"/>
               </w:rPr>
               <w:t>factor</w:t>
             </w:r>
@@ -703,14 +902,14 @@
         <w:tc>
           <w:tcPr>
             <w:tcW w:type="dxa" w:w="4320"/>
-            <w:shd w:fill="1E3A5F"/>
+            <w:shd w:fill="004889"/>
           </w:tcPr>
           <w:p>
             <w:r>
               <w:rPr>
                 <w:b/>
-                <w:color w:val="FFFFFF"/>
-                <w:sz w:val="22"/>
+                <w:color w:val="FFFEFB"/>
+                <w:sz w:val="18"/>
               </w:rPr>
               <w:t>contribution</w:t>
             </w:r>
@@ -721,14 +920,14 @@
         <w:tc>
           <w:tcPr>
             <w:tcW w:type="dxa" w:w="4320"/>
-            <w:shd w:fill="F0A500"/>
+            <w:shd w:fill="AC916B"/>
           </w:tcPr>
           <w:p>
             <w:r>
               <w:rPr>
-                <w:rFonts w:ascii="Calibri" w:hAnsi="Calibri"/>
+                <w:rFonts w:ascii="JetBrains Mono" w:hAnsi="JetBrains Mono"/>
                 <w:b/>
-                <w:color w:val="333333"/>
+                <w:color w:val="1F1A12"/>
                 <w:sz w:val="20"/>
               </w:rPr>
               <w:t>船舶到港数</w:t>
@@ -738,14 +937,14 @@
         <w:tc>
           <w:tcPr>
             <w:tcW w:type="dxa" w:w="4320"/>
-            <w:shd w:fill="C62828"/>
+            <w:shd w:fill="8B4A2B"/>
           </w:tcPr>
           <w:p>
             <w:r>
               <w:rPr>
-                <w:rFonts w:ascii="Calibri" w:hAnsi="Calibri"/>
+                <w:rFonts w:ascii="JetBrains Mono" w:hAnsi="JetBrains Mono"/>
                 <w:b/>
-                <w:color w:val="FFFFFF"/>
+                <w:color w:val="FFFEFB"/>
                 <w:sz w:val="20"/>
               </w:rPr>
               <w:t>0.4200</w:t>
@@ -757,14 +956,14 @@
         <w:tc>
           <w:tcPr>
             <w:tcW w:type="dxa" w:w="4320"/>
-            <w:shd w:fill="F0A500"/>
+            <w:shd w:fill="AC916B"/>
           </w:tcPr>
           <w:p>
             <w:r>
               <w:rPr>
-                <w:rFonts w:ascii="Calibri" w:hAnsi="Calibri"/>
+                <w:rFonts w:ascii="JetBrains Mono" w:hAnsi="JetBrains Mono"/>
                 <w:b/>
-                <w:color w:val="333333"/>
+                <w:color w:val="1F1A12"/>
                 <w:sz w:val="20"/>
               </w:rPr>
               <w:t>装卸效率</w:t>
@@ -774,14 +973,14 @@
         <w:tc>
           <w:tcPr>
             <w:tcW w:type="dxa" w:w="4320"/>
-            <w:shd w:fill="C62828"/>
+            <w:shd w:fill="8B4A2B"/>
           </w:tcPr>
           <w:p>
             <w:r>
               <w:rPr>
-                <w:rFonts w:ascii="Calibri" w:hAnsi="Calibri"/>
+                <w:rFonts w:ascii="JetBrains Mono" w:hAnsi="JetBrains Mono"/>
                 <w:b/>
-                <w:color w:val="FFFFFF"/>
+                <w:color w:val="FFFEFB"/>
                 <w:sz w:val="20"/>
               </w:rPr>
               <w:t>0.3100</w:t>
@@ -793,14 +992,14 @@
         <w:tc>
           <w:tcPr>
             <w:tcW w:type="dxa" w:w="4320"/>
-            <w:shd w:fill="F0A500"/>
+            <w:shd w:fill="AC916B"/>
           </w:tcPr>
           <w:p>
             <w:r>
               <w:rPr>
-                <w:rFonts w:ascii="Calibri" w:hAnsi="Calibri"/>
+                <w:rFonts w:ascii="JetBrains Mono" w:hAnsi="JetBrains Mono"/>
                 <w:b/>
-                <w:color w:val="333333"/>
+                <w:color w:val="1F1A12"/>
                 <w:sz w:val="20"/>
               </w:rPr>
               <w:t>天气因素</w:t>
@@ -810,14 +1009,14 @@
         <w:tc>
           <w:tcPr>
             <w:tcW w:type="dxa" w:w="4320"/>
-            <w:shd w:fill="C62828"/>
+            <w:shd w:fill="8B4A2B"/>
           </w:tcPr>
           <w:p>
             <w:r>
               <w:rPr>
-                <w:rFonts w:ascii="Calibri" w:hAnsi="Calibri"/>
+                <w:rFonts w:ascii="JetBrains Mono" w:hAnsi="JetBrains Mono"/>
                 <w:b/>
-                <w:color w:val="FFFFFF"/>
+                <w:color w:val="FFFEFB"/>
                 <w:sz w:val="20"/>
               </w:rPr>
               <w:t>-0.0800</w:t>
@@ -829,14 +1028,14 @@
         <w:tc>
           <w:tcPr>
             <w:tcW w:type="dxa" w:w="4320"/>
-            <w:shd w:fill="F0A500"/>
+            <w:shd w:fill="AC916B"/>
           </w:tcPr>
           <w:p>
             <w:r>
               <w:rPr>
-                <w:rFonts w:ascii="Calibri" w:hAnsi="Calibri"/>
+                <w:rFonts w:ascii="JetBrains Mono" w:hAnsi="JetBrains Mono"/>
                 <w:b/>
-                <w:color w:val="333333"/>
+                <w:color w:val="1F1A12"/>
                 <w:sz w:val="20"/>
               </w:rPr>
               <w:t>其它</w:t>
@@ -846,14 +1045,14 @@
         <w:tc>
           <w:tcPr>
             <w:tcW w:type="dxa" w:w="4320"/>
-            <w:shd w:fill="C62828"/>
+            <w:shd w:fill="8B4A2B"/>
           </w:tcPr>
           <w:p>
             <w:r>
               <w:rPr>
-                <w:rFonts w:ascii="Calibri" w:hAnsi="Calibri"/>
+                <w:rFonts w:ascii="JetBrains Mono" w:hAnsi="JetBrains Mono"/>
                 <w:b/>
-                <w:color w:val="FFFFFF"/>
+                <w:color w:val="FFFEFB"/>
                 <w:sz w:val="20"/>
               </w:rPr>
               <w:t>0.0500</w:t>
@@ -865,6 +1064,8 @@
     <w:p/>
     <w:p>
       <w:pPr>
+        <w:pStyle w:val="Callout"/>
+        <w:ind w:firstLine="0"/>
         <w:pBdr>
           <w:left w:val="single" w:sz="24" w:space="6" w:color="C62828"/>
         </w:pBdr>
@@ -872,18 +1073,18 @@
       </w:pPr>
       <w:r>
         <w:rPr>
-          <w:rFonts w:ascii="Microsoft YaHei" w:hAnsi="Microsoft YaHei"/>
+          <w:rFonts w:ascii="Noto Serif SC" w:hAnsi="Noto Serif SC"/>
           <w:b/>
           <w:color w:val="C62828"/>
-          <w:sz w:val="24"/>
+          <w:sz w:val="22"/>
         </w:rPr>
         <w:t>⚠ 注意：</w:t>
       </w:r>
       <w:r>
         <w:rPr>
-          <w:rFonts w:ascii="Microsoft YaHei" w:hAnsi="Microsoft YaHei"/>
-          <w:color w:val="333333"/>
-          <w:sz w:val="24"/>
+          <w:rFonts w:ascii="Noto Serif SC" w:hAnsi="Noto Serif SC"/>
+          <w:color w:val="1F1A12"/>
+          <w:sz w:val="22"/>
         </w:rPr>
         <w:t>锦州港 yoy -3% 已连续两个季度走弱，需要警惕设备老化风险。</w:t>
       </w:r>
@@ -891,6 +1092,8 @@
     <w:p/>
     <w:p>
       <w:pPr>
+        <w:pStyle w:val="Callout"/>
+        <w:ind w:firstLine="0"/>
         <w:pBdr>
           <w:left w:val="single" w:sz="24" w:space="6" w:color="1976D2"/>
         </w:pBdr>
@@ -898,23 +1101,38 @@
       </w:pPr>
       <w:r>
         <w:rPr>
-          <w:rFonts w:ascii="Microsoft YaHei" w:hAnsi="Microsoft YaHei"/>
+          <w:rFonts w:ascii="Noto Serif SC" w:hAnsi="Noto Serif SC"/>
           <w:b/>
           <w:color w:val="1976D2"/>
-          <w:sz w:val="24"/>
+          <w:sz w:val="22"/>
         </w:rPr>
         <w:t>💡 提示：</w:t>
       </w:r>
       <w:r>
         <w:rPr>
-          <w:rFonts w:ascii="Microsoft YaHei" w:hAnsi="Microsoft YaHei"/>
-          <w:color w:val="333333"/>
-          <w:sz w:val="24"/>
+          <w:rFonts w:ascii="Noto Serif SC" w:hAnsi="Noto Serif SC"/>
+          <w:color w:val="1F1A12"/>
+          <w:sz w:val="22"/>
         </w:rPr>
         <w:t>装卸效率提升对总吞吐贡献 31%，推荐复制至其它港区。</w:t>
       </w:r>
     </w:p>
     <w:p/>
+    <w:p>
+      <w:pPr>
+        <w:spacing w:after="0" w:before="320"/>
+        <w:ind w:firstLine="0"/>
+      </w:pPr>
+      <w:r>
+        <w:rPr>
+          <w:rFonts w:ascii="Noto Serif SC" w:hAnsi="Noto Serif SC"/>
+          <w:i/>
+          <w:color w:val="AC916B"/>
+          <w:sz w:val="72"/>
+        </w:rPr>
+        <w:t>IV</w:t>
+      </w:r>
+    </w:p>
     <w:p>
       <w:pPr>
         <w:pStyle w:val="Heading1"/>
@@ -939,14 +1157,14 @@
         <w:tc>
           <w:tcPr>
             <w:tcW w:type="dxa" w:w="2880"/>
-            <w:shd w:fill="1E3A5F"/>
+            <w:shd w:fill="004889"/>
           </w:tcPr>
           <w:p>
             <w:r>
               <w:rPr>
                 <w:b/>
-                <w:color w:val="FFFFFF"/>
-                <w:sz w:val="22"/>
+                <w:color w:val="FFFEFB"/>
+                <w:sz w:val="18"/>
               </w:rPr>
               <w:t>短期 (Q2)</w:t>
             </w:r>
@@ -955,14 +1173,14 @@
         <w:tc>
           <w:tcPr>
             <w:tcW w:type="dxa" w:w="2880"/>
-            <w:shd w:fill="1E3A5F"/>
+            <w:shd w:fill="004889"/>
           </w:tcPr>
           <w:p>
             <w:r>
               <w:rPr>
                 <w:b/>
-                <w:color w:val="FFFFFF"/>
-                <w:sz w:val="22"/>
+                <w:color w:val="FFFEFB"/>
+                <w:sz w:val="18"/>
               </w:rPr>
               <w:t>中期 (H2)</w:t>
             </w:r>
@@ -971,14 +1189,14 @@
         <w:tc>
           <w:tcPr>
             <w:tcW w:type="dxa" w:w="2880"/>
-            <w:shd w:fill="1E3A5F"/>
+            <w:shd w:fill="004889"/>
           </w:tcPr>
           <w:p>
             <w:r>
               <w:rPr>
                 <w:b/>
-                <w:color w:val="FFFFFF"/>
-                <w:sz w:val="22"/>
+                <w:color w:val="FFFEFB"/>
+                <w:sz w:val="18"/>
               </w:rPr>
               <w:t>长期 (2027+)</w:t>
             </w:r>
@@ -993,7 +1211,7 @@
           <w:p>
             <w:r>
               <w:rPr>
-                <w:sz w:val="24"/>
+                <w:sz w:val="22"/>
               </w:rPr>
               <w:t>• 锦州港启动设备巡检专项</w:t>
             </w:r>
@@ -1006,7 +1224,7 @@
           <w:p>
             <w:r>
               <w:rPr>
-                <w:sz w:val="24"/>
+                <w:sz w:val="22"/>
               </w:rPr>
               <w:t>• 营口港运力扩张 +15%</w:t>
             </w:r>
@@ -1019,7 +1237,7 @@
           <w:p>
             <w:r>
               <w:rPr>
-                <w:sz w:val="24"/>
+                <w:sz w:val="22"/>
               </w:rPr>
               <w:t>• 三港区一体化调度</w:t>
             </w:r>
@@ -1034,7 +1252,7 @@
           <w:p>
             <w:r>
               <w:rPr>
-                <w:sz w:val="24"/>
+                <w:sz w:val="22"/>
               </w:rPr>
               <w:t>• 复用大连港装卸 SOP</w:t>
             </w:r>
@@ -1047,7 +1265,7 @@
           <w:p>
             <w:r>
               <w:rPr>
-                <w:sz w:val="24"/>
+                <w:sz w:val="22"/>
               </w:rPr>
               <w:t>• 天气联动调度系统上线</w:t>
             </w:r>
@@ -1060,7 +1278,7 @@
           <w:p>
             <w:r>
               <w:rPr>
-                <w:sz w:val="24"/>
+                <w:sz w:val="22"/>
               </w:rPr>
               <w:t>• 智能设备改造完成</w:t>
             </w:r>
@@ -1096,15 +1314,15 @@
         <w:tc>
           <w:tcPr>
             <w:tcW w:type="dxa" w:w="1440"/>
-            <w:shd w:fill="1E3A5F"/>
+            <w:shd w:fill="004889"/>
           </w:tcPr>
           <w:p>
             <w:r>
               <w:rPr>
-                <w:rFonts w:ascii="Calibri" w:hAnsi="Calibri"/>
+                <w:rFonts w:ascii="JetBrains Mono" w:hAnsi="JetBrains Mono"/>
                 <w:b/>
-                <w:color w:val="FFFFFF"/>
-                <w:sz w:val="22"/>
+                <w:color w:val="FFFEFB"/>
+                <w:sz w:val="18"/>
               </w:rPr>
               <w:t>指标</w:t>
             </w:r>
@@ -1113,15 +1331,15 @@
         <w:tc>
           <w:tcPr>
             <w:tcW w:type="dxa" w:w="1440"/>
-            <w:shd w:fill="1E3A5F"/>
+            <w:shd w:fill="004889"/>
           </w:tcPr>
           <w:p>
             <w:r>
               <w:rPr>
-                <w:rFonts w:ascii="Calibri" w:hAnsi="Calibri"/>
+                <w:rFonts w:ascii="JetBrains Mono" w:hAnsi="JetBrains Mono"/>
                 <w:b/>
-                <w:color w:val="FFFFFF"/>
-                <w:sz w:val="22"/>
+                <w:color w:val="FFFEFB"/>
+                <w:sz w:val="18"/>
               </w:rPr>
               <w:t>均值</w:t>
             </w:r>
@@ -1130,15 +1348,15 @@
         <w:tc>
           <w:tcPr>
             <w:tcW w:type="dxa" w:w="1440"/>
-            <w:shd w:fill="1E3A5F"/>
+            <w:shd w:fill="004889"/>
           </w:tcPr>
           <w:p>
             <w:r>
               <w:rPr>
-                <w:rFonts w:ascii="Calibri" w:hAnsi="Calibri"/>
+                <w:rFonts w:ascii="JetBrains Mono" w:hAnsi="JetBrains Mono"/>
                 <w:b/>
-                <w:color w:val="FFFFFF"/>
-                <w:sz w:val="22"/>
+                <w:color w:val="FFFEFB"/>
+                <w:sz w:val="18"/>
               </w:rPr>
               <w:t>中位数</w:t>
             </w:r>
@@ -1147,15 +1365,15 @@
         <w:tc>
           <w:tcPr>
             <w:tcW w:type="dxa" w:w="1440"/>
-            <w:shd w:fill="1E3A5F"/>
+            <w:shd w:fill="004889"/>
           </w:tcPr>
           <w:p>
             <w:r>
               <w:rPr>
-                <w:rFonts w:ascii="Calibri" w:hAnsi="Calibri"/>
+                <w:rFonts w:ascii="JetBrains Mono" w:hAnsi="JetBrains Mono"/>
                 <w:b/>
-                <w:color w:val="FFFFFF"/>
-                <w:sz w:val="22"/>
+                <w:color w:val="FFFEFB"/>
+                <w:sz w:val="18"/>
               </w:rPr>
               <w:t>标准差</w:t>
             </w:r>
@@ -1164,15 +1382,15 @@
         <w:tc>
           <w:tcPr>
             <w:tcW w:type="dxa" w:w="1440"/>
-            <w:shd w:fill="1E3A5F"/>
+            <w:shd w:fill="004889"/>
           </w:tcPr>
           <w:p>
             <w:r>
               <w:rPr>
-                <w:rFonts w:ascii="Calibri" w:hAnsi="Calibri"/>
+                <w:rFonts w:ascii="JetBrains Mono" w:hAnsi="JetBrains Mono"/>
                 <w:b/>
-                <w:color w:val="FFFFFF"/>
-                <w:sz w:val="22"/>
+                <w:color w:val="FFFEFB"/>
+                <w:sz w:val="18"/>
               </w:rPr>
               <w:t>最小值</w:t>
             </w:r>
@@ -1181,15 +1399,15 @@
         <w:tc>
           <w:tcPr>
             <w:tcW w:type="dxa" w:w="1440"/>
-            <w:shd w:fill="1E3A5F"/>
+            <w:shd w:fill="004889"/>
           </w:tcPr>
           <w:p>
             <w:r>
               <w:rPr>
-                <w:rFonts w:ascii="Calibri" w:hAnsi="Calibri"/>
+                <w:rFonts w:ascii="JetBrains Mono" w:hAnsi="JetBrains Mono"/>
                 <w:b/>
-                <w:color w:val="FFFFFF"/>
-                <w:sz w:val="22"/>
+                <w:color w:val="FFFEFB"/>
+                <w:sz w:val="18"/>
               </w:rPr>
               <w:t>最大值</w:t>
             </w:r>
@@ -1204,7 +1422,7 @@
           <w:p>
             <w:r>
               <w:rPr>
-                <w:rFonts w:ascii="Microsoft YaHei" w:hAnsi="Microsoft YaHei"/>
+                <w:rFonts w:ascii="Noto Serif SC" w:hAnsi="Noto Serif SC"/>
                 <w:sz w:val="20"/>
               </w:rPr>
               <w:t>throughput</w:t>
@@ -1218,7 +1436,7 @@
           <w:p>
             <w:r>
               <w:rPr>
-                <w:rFonts w:ascii="Calibri" w:hAnsi="Calibri"/>
+                <w:rFonts w:ascii="JetBrains Mono" w:hAnsi="JetBrains Mono"/>
                 <w:sz w:val="20"/>
               </w:rPr>
               <w:t>3,166.87</w:t>
@@ -1232,7 +1450,7 @@
           <w:p>
             <w:r>
               <w:rPr>
-                <w:rFonts w:ascii="Calibri" w:hAnsi="Calibri"/>
+                <w:rFonts w:ascii="JetBrains Mono" w:hAnsi="JetBrains Mono"/>
                 <w:sz w:val="20"/>
               </w:rPr>
               <w:t>-</w:t>
@@ -1246,7 +1464,7 @@
           <w:p>
             <w:r>
               <w:rPr>
-                <w:rFonts w:ascii="Calibri" w:hAnsi="Calibri"/>
+                <w:rFonts w:ascii="JetBrains Mono" w:hAnsi="JetBrains Mono"/>
                 <w:sz w:val="20"/>
               </w:rPr>
               <w:t>1,102.30</w:t>
@@ -1260,7 +1478,7 @@
           <w:p>
             <w:r>
               <w:rPr>
-                <w:rFonts w:ascii="Calibri" w:hAnsi="Calibri"/>
+                <w:rFonts w:ascii="JetBrains Mono" w:hAnsi="JetBrains Mono"/>
                 <w:sz w:val="20"/>
               </w:rPr>
               <w:t>1,800.00</w:t>
@@ -1274,7 +1492,7 @@
           <w:p>
             <w:r>
               <w:rPr>
-                <w:rFonts w:ascii="Calibri" w:hAnsi="Calibri"/>
+                <w:rFonts w:ascii="JetBrains Mono" w:hAnsi="JetBrains Mono"/>
                 <w:sz w:val="20"/>
               </w:rPr>
               <w:t>4,500.50</w:t>
@@ -1295,7 +1513,7 @@
     <w:p>
       <w:r>
         <w:rPr>
-          <w:color w:val="546E7A"/>
+          <w:color w:val="9A8E78"/>
         </w:rPr>
         <w:t>以上分析基于数据，仅供参考。</w:t>
       </w:r>
@@ -1337,12 +1555,14 @@
   <w:p>
     <w:pPr>
       <w:pStyle w:val="Header"/>
-      <w:jc w:val="right"/>
+      <w:jc w:val="left"/>
     </w:pPr>
     <w:r>
       <w:rPr>
-        <w:color w:val="546E7A"/>
-        <w:sz w:val="20"/>
+        <w:rFonts w:ascii="Noto Sans SC" w:hAnsi="Noto Sans SC"/>
+        <w:color w:val="AC916B"/>
+        <w:sz w:val="16"/>
+        <w:smallCaps w:val="true"/>
       </w:rPr>
       <w:t>2026 Q1 港区吞吐量分析报告 (Enhanced)</w:t>
     </w:r>
@@ -1714,12 +1934,15 @@
     <w:qFormat/>
     <w:rsid w:val="00FC693F"/>
     <w:pPr>
-      <w:spacing w:after="120" w:line="360" w:lineRule="auto"/>
+      <w:spacing w:after="80" w:line="360" w:lineRule="auto"/>
+      <w:ind w:firstLine="425"/>
     </w:pPr>
     <w:rPr>
-      <w:rFonts w:ascii="Microsoft YaHei" w:hAnsi="Microsoft YaHei" w:eastAsia="Microsoft YaHei"/>
-      <w:color w:val="546E7A"/>
-      <w:sz w:val="24"/>
+      <w:rFonts w:ascii="Noto Serif SC" w:hAnsi="Noto Serif SC" w:eastAsia="Noto Serif SC"/>
+      <w:b w:val="0"/>
+      <w:i w:val="0"/>
+      <w:color w:val="1F1A12"/>
+      <w:sz w:val="22"/>
     </w:rPr>
   </w:style>
   <w:style w:type="paragraph" w:styleId="Header">
@@ -1777,14 +2000,18 @@
     <w:pPr>
       <w:keepNext/>
       <w:keepLines/>
-      <w:spacing w:before="480" w:after="0"/>
+      <w:spacing w:before="480" w:after="160"/>
       <w:outlineLvl w:val="0"/>
+      <w:pBdr>
+        <w:top w:val="single" w:sz="8" w:space="4" w:color="004889"/>
+      </w:pBdr>
     </w:pPr>
     <w:rPr>
-      <w:rFonts w:asciiTheme="majorHAnsi" w:eastAsiaTheme="majorEastAsia" w:hAnsiTheme="majorHAnsi" w:cstheme="majorBidi" w:ascii="Microsoft YaHei" w:hAnsi="Microsoft YaHei" w:eastAsia="Microsoft YaHei"/>
+      <w:rFonts w:asciiTheme="majorHAnsi" w:eastAsiaTheme="majorEastAsia" w:hAnsiTheme="majorHAnsi" w:cstheme="majorBidi" w:ascii="Noto Serif SC" w:hAnsi="Noto Serif SC" w:eastAsia="Noto Serif SC"/>
       <w:b/>
       <w:bCs/>
-      <w:color w:val="1E3A5F"/>
+      <w:i w:val="0"/>
+      <w:color w:val="1F1A12"/>
       <w:sz w:val="44"/>
       <w:szCs w:val="28"/>
     </w:rPr>
@@ -1801,15 +2028,16 @@
     <w:pPr>
       <w:keepNext/>
       <w:keepLines/>
-      <w:spacing w:before="200" w:after="0"/>
+      <w:spacing w:before="320" w:after="120"/>
       <w:outlineLvl w:val="1"/>
     </w:pPr>
     <w:rPr>
-      <w:rFonts w:asciiTheme="majorHAnsi" w:eastAsiaTheme="majorEastAsia" w:hAnsiTheme="majorHAnsi" w:cstheme="majorBidi" w:ascii="Microsoft YaHei" w:hAnsi="Microsoft YaHei" w:eastAsia="Microsoft YaHei"/>
+      <w:rFonts w:asciiTheme="majorHAnsi" w:eastAsiaTheme="majorEastAsia" w:hAnsiTheme="majorHAnsi" w:cstheme="majorBidi" w:ascii="Noto Serif SC" w:hAnsi="Noto Serif SC" w:eastAsia="Noto Serif SC"/>
       <w:b/>
       <w:bCs/>
-      <w:color w:val="2D5F8A"/>
-      <w:sz w:val="36"/>
+      <w:i w:val="0"/>
+      <w:color w:val="1F1A12"/>
+      <w:sz w:val="32"/>
       <w:szCs w:val="26"/>
     </w:rPr>
   </w:style>
@@ -1825,14 +2053,16 @@
     <w:pPr>
       <w:keepNext/>
       <w:keepLines/>
-      <w:spacing w:before="200" w:after="0"/>
+      <w:spacing w:before="240" w:after="80"/>
       <w:outlineLvl w:val="2"/>
     </w:pPr>
     <w:rPr>
-      <w:rFonts w:asciiTheme="majorHAnsi" w:eastAsiaTheme="majorEastAsia" w:hAnsiTheme="majorHAnsi" w:cstheme="majorBidi"/>
+      <w:rFonts w:asciiTheme="majorHAnsi" w:eastAsiaTheme="majorEastAsia" w:hAnsiTheme="majorHAnsi" w:cstheme="majorBidi" w:ascii="Noto Serif SC" w:hAnsi="Noto Serif SC" w:eastAsia="Noto Serif SC"/>
       <w:b/>
       <w:bCs/>
-      <w:color w:val="4F81BD" w:themeColor="accent1"/>
+      <w:i w:val="0"/>
+      <w:color w:val="1F1A12"/>
+      <w:sz w:val="28"/>
     </w:rPr>
   </w:style>
   <w:style w:type="paragraph" w:styleId="Heading4">
@@ -2066,15 +2296,21 @@
       <w:pBdr>
         <w:bottom w:val="single" w:sz="8" w:space="4" w:color="4F81BD" w:themeColor="accent1"/>
       </w:pBdr>
-      <w:spacing w:after="300" w:line="240" w:lineRule="auto"/>
+      <w:spacing w:after="160" w:line="240" w:lineRule="auto"/>
       <w:contextualSpacing/>
+      <w:jc w:val="left"/>
+      <w:pBdr>
+        <w:bottom w:val="single" w:sz="8" w:space="4" w:color="004889"/>
+      </w:pBdr>
     </w:pPr>
     <w:rPr>
-      <w:rFonts w:asciiTheme="majorHAnsi" w:eastAsiaTheme="majorEastAsia" w:hAnsiTheme="majorHAnsi" w:cstheme="majorBidi"/>
-      <w:color w:val="17365D" w:themeColor="text2" w:themeShade="BF"/>
+      <w:rFonts w:asciiTheme="majorHAnsi" w:eastAsiaTheme="majorEastAsia" w:hAnsiTheme="majorHAnsi" w:cstheme="majorBidi" w:ascii="Noto Serif SC" w:hAnsi="Noto Serif SC" w:eastAsia="Noto Serif SC"/>
+      <w:b/>
+      <w:i w:val="0"/>
+      <w:color w:val="004889"/>
       <w:spacing w:val="5"/>
       <w:kern w:val="28"/>
-      <w:sz w:val="52"/>
+      <w:sz w:val="64"/>
       <w:szCs w:val="52"/>
     </w:rPr>
   </w:style>
@@ -2105,14 +2341,16 @@
       <w:numPr>
         <w:ilvl w:val="1"/>
       </w:numPr>
+      <w:spacing w:after="480"/>
     </w:pPr>
     <w:rPr>
-      <w:rFonts w:asciiTheme="majorHAnsi" w:eastAsiaTheme="majorEastAsia" w:hAnsiTheme="majorHAnsi" w:cstheme="majorBidi"/>
+      <w:rFonts w:asciiTheme="majorHAnsi" w:eastAsiaTheme="majorEastAsia" w:hAnsiTheme="majorHAnsi" w:cstheme="majorBidi" w:ascii="Noto Serif SC" w:hAnsi="Noto Serif SC" w:eastAsia="Noto Serif SC"/>
+      <w:b w:val="0"/>
       <w:i/>
       <w:iCs/>
-      <w:color w:val="4F81BD" w:themeColor="accent1"/>
+      <w:color w:val="336EA4"/>
       <w:spacing w:val="15"/>
-      <w:sz w:val="24"/>
+      <w:sz w:val="36"/>
       <w:szCs w:val="24"/>
     </w:rPr>
   </w:style>
@@ -13403,6 +13641,135 @@
         <w:shd w:val="clear" w:color="auto" w:fill="FBCAA2" w:themeFill="accent6" w:themeFillTint="7F"/>
       </w:tcPr>
     </w:tblStylePr>
+  </w:style>
+  <w:style w:type="paragraph" w:customStyle="1" w:styleId="Lede">
+    <w:name w:val="Lede"/>
+    <w:pPr>
+      <w:spacing w:after="240" w:before="80"/>
+      <w:ind w:firstLine="0"/>
+    </w:pPr>
+    <w:rPr>
+      <w:rFonts w:ascii="Noto Serif SC" w:hAnsi="Noto Serif SC" w:eastAsia="Noto Serif SC"/>
+      <w:b w:val="0"/>
+      <w:i/>
+      <w:color w:val="1F1A12"/>
+      <w:sz w:val="28"/>
+    </w:rPr>
+  </w:style>
+  <w:style w:type="paragraph" w:customStyle="1" w:styleId="Narrative">
+    <w:name w:val="Narrative"/>
+    <w:pPr>
+      <w:spacing w:line="360" w:lineRule="auto" w:after="80"/>
+      <w:ind w:firstLine="425"/>
+    </w:pPr>
+    <w:rPr>
+      <w:rFonts w:ascii="Noto Serif SC" w:hAnsi="Noto Serif SC" w:eastAsia="Noto Serif SC"/>
+      <w:b w:val="0"/>
+      <w:i w:val="0"/>
+      <w:color w:val="1F1A12"/>
+      <w:sz w:val="22"/>
+    </w:rPr>
+  </w:style>
+  <w:style w:type="paragraph" w:customStyle="1" w:styleId="Callout">
+    <w:name w:val="Callout"/>
+    <w:pPr>
+      <w:spacing w:after="160" w:before="80"/>
+      <w:ind w:firstLine="0"/>
+      <w:pBdr>
+        <w:left w:val="single" w:sz="18" w:space="8" w:color="AC916B"/>
+      </w:pBdr>
+      <w:shd w:val="clear" w:color="auto" w:fill="FBF6EE"/>
+    </w:pPr>
+    <w:rPr>
+      <w:rFonts w:ascii="Noto Serif SC" w:hAnsi="Noto Serif SC" w:eastAsia="Noto Serif SC"/>
+      <w:b w:val="0"/>
+      <w:i w:val="0"/>
+      <w:color w:val="1F1A12"/>
+      <w:sz w:val="22"/>
+    </w:rPr>
+  </w:style>
+  <w:style w:type="paragraph" w:customStyle="1" w:styleId="Pullquote">
+    <w:name w:val="Pullquote"/>
+    <w:pPr>
+      <w:spacing w:after="240"/>
+      <w:ind w:firstLine="0" w:left="850"/>
+      <w:pBdr>
+        <w:left w:val="single" w:sz="24" w:space="8" w:color="AC916B"/>
+      </w:pBdr>
+    </w:pPr>
+    <w:rPr>
+      <w:rFonts w:ascii="Noto Serif SC" w:hAnsi="Noto Serif SC" w:eastAsia="Noto Serif SC"/>
+      <w:b w:val="0"/>
+      <w:i/>
+      <w:color w:val="1F1A12"/>
+      <w:sz w:val="28"/>
+    </w:rPr>
+  </w:style>
+  <w:style w:type="paragraph" w:customStyle="1" w:styleId="Source">
+    <w:name w:val="Source"/>
+    <w:pPr>
+      <w:spacing w:before="120" w:after="80"/>
+      <w:ind w:firstLine="0"/>
+    </w:pPr>
+    <w:rPr>
+      <w:rFonts w:ascii="Noto Sans SC" w:hAnsi="Noto Sans SC" w:eastAsia="Noto Sans SC"/>
+      <w:b w:val="0"/>
+      <w:i/>
+      <w:color w:val="9A8E78"/>
+      <w:sz w:val="18"/>
+    </w:rPr>
+  </w:style>
+  <w:style w:type="character" w:customStyle="1" w:styleId="Kicker">
+    <w:name w:val="Kicker"/>
+    <w:rPr>
+      <w:rFonts w:ascii="Noto Sans SC" w:hAnsi="Noto Sans SC" w:eastAsia="Noto Sans SC"/>
+      <w:b w:val="0"/>
+      <w:i w:val="0"/>
+      <w:color w:val="004889"/>
+      <w:sz w:val="18"/>
+      <w:smallCaps w:val="true"/>
+    </w:rPr>
+  </w:style>
+  <w:style w:type="character" w:customStyle="1" w:styleId="KPIValue">
+    <w:name w:val="KPIValue"/>
+    <w:rPr>
+      <w:rFonts w:ascii="JetBrains Mono" w:hAnsi="JetBrains Mono" w:eastAsia="JetBrains Mono"/>
+      <w:b w:val="0"/>
+      <w:i w:val="0"/>
+      <w:color w:val="004889"/>
+      <w:sz w:val="56"/>
+    </w:rPr>
+  </w:style>
+  <w:style w:type="character" w:customStyle="1" w:styleId="KPILabel">
+    <w:name w:val="KPILabel"/>
+    <w:rPr>
+      <w:rFonts w:ascii="Noto Sans SC" w:hAnsi="Noto Sans SC" w:eastAsia="Noto Sans SC"/>
+      <w:b w:val="0"/>
+      <w:i w:val="0"/>
+      <w:color w:val="9A8E78"/>
+      <w:sz w:val="16"/>
+      <w:smallCaps w:val="true"/>
+    </w:rPr>
+  </w:style>
+  <w:style w:type="character" w:customStyle="1" w:styleId="TableHeader">
+    <w:name w:val="TableHeader"/>
+    <w:rPr>
+      <w:rFonts w:ascii="Noto Sans SC" w:hAnsi="Noto Sans SC" w:eastAsia="Noto Sans SC"/>
+      <w:b w:val="0"/>
+      <w:i w:val="0"/>
+      <w:color w:val="9A8E78"/>
+      <w:sz w:val="18"/>
+    </w:rPr>
+  </w:style>
+  <w:style w:type="character" w:customStyle="1" w:styleId="TableNum">
+    <w:name w:val="TableNum"/>
+    <w:rPr>
+      <w:rFonts w:ascii="JetBrains Mono" w:hAnsi="JetBrains Mono" w:eastAsia="JetBrains Mono"/>
+      <w:b w:val="0"/>
+      <w:i w:val="0"/>
+      <w:color w:val="1F1A12"/>
+      <w:sz w:val="20"/>
+    </w:rPr>
   </w:style>
 </w:styles>
 </file>

</xml_diff>